<commit_message>
Fix stale zip filename in user guide's own install step
Seren_3.9.4_User_Guide.docx's own Section 6/Step 2 still told
readers to fetch plugin.video.seren-3.9.1.zip after the previous
commit (a6e9914) only fixed the RLI content and title elsewhere
in the same document. Bumped the Step 2 heading and zip filename
to 3.9.4, matching what was already done for the repo's zip and
for Seren_3.9.4_Install_Instructions.md (Dropbox-side only, no
repo counterpart).

Co-Authored-By: Claude Sonnet 5 <noreply@anthropic.com>
</commit_message>
<xml_diff>
--- a/Seren_3.9.4_User_Guide.docx
+++ b/Seren_3.9.4_User_Guide.docx
@@ -4257,7 +4257,7 @@
         <w:pStyle w:val="Heading3"/>
       </w:pPr>
       <w:r>
-        <w:t xml:space="preserve">Step 2 — Install the Nixgate Fork (3.9.1)</w:t>
+        <w:t xml:space="preserve">Step 2 — Install the Nixgate Fork (3.9.4)</w:t>
       </w:r>
     </w:p>
     <w:p>
@@ -4275,7 +4275,7 @@
         <w:rPr>
           <w:rStyle w:val="VerbatimChar"/>
         </w:rPr>
-        <w:t xml:space="preserve">plugin.video.seren-3.9.1.zip</w:t>
+        <w:t xml:space="preserve">plugin.video.seren-3.9.4.zip</w:t>
       </w:r>
       <w:r>
         <w:t xml:space="preserve"> to a location Kodi can reach (USB drive, local folder, or network share).</w:t>

</xml_diff>